<commit_message>
Sync schedule files 2026-04-30 13:54
</commit_message>
<xml_diff>
--- a/schedule/02.05.2026 СУББОТА.docx
+++ b/schedule/02.05.2026 СУББОТА.docx
@@ -1,6 +1,6 @@
 
 <file path=word/document.xml><?xml version="1.0" encoding="utf-8"?>
-<w:document xmlns:r="http://schemas.openxmlformats.org/officeDocument/2006/relationships" xmlns:mc="http://schemas.openxmlformats.org/markup-compatibility/2006" xmlns:vyd="http://volga.yandex.com/schemas/document/model" xmlns:w="http://schemas.openxmlformats.org/wordprocessingml/2006/main" w:conformance="transitional" mc:Ignorable="vyd">
+<w:document xmlns:w="http://schemas.openxmlformats.org/wordprocessingml/2006/main" xmlns:vyd="http://volga.yandex.com/schemas/document/model" xmlns:mc="http://schemas.openxmlformats.org/markup-compatibility/2006" xmlns:r="http://schemas.openxmlformats.org/officeDocument/2006/relationships" w:conformance="transitional" mc:Ignorable="vyd">
   <w:background w:color="FFFFFF"/>
   <w:body vyd:_id="vyd:00000000000001">
     <w:p vyd:_id="vyd:000000000002e5">
@@ -1150,6 +1150,13 @@
                 <w:szCs w:val="24"/>
               </w:rPr>
             </w:pPr>
+            <w:r>
+              <w:rPr>
+                <w:rFonts w:ascii="Times New Roman" w:hAnsi="Times New Roman" w:cs="Times New Roman"/>
+                <w:sz w:val="24"/>
+              </w:rPr>
+              <w:t vyd:_id="vyd:molj9oijap9bao">Тригонометрические уравнения</w:t>
+            </w:r>
           </w:p>
         </w:tc>
         <w:tc vyd:_id="vyd:000000000002b5">
@@ -1394,6 +1401,13 @@
                 <w:szCs w:val="24"/>
               </w:rPr>
             </w:pPr>
+            <w:r>
+              <w:rPr>
+                <w:rFonts w:ascii="Times New Roman" w:hAnsi="Times New Roman" w:cs="Times New Roman"/>
+                <w:sz w:val="24"/>
+              </w:rPr>
+              <w:t vyd:_id="vyd:moljaj0btvt1ii">МАХ</w:t>
+            </w:r>
           </w:p>
         </w:tc>
         <w:tc vyd:_id="vyd:000000000002ak">
@@ -1620,6 +1634,13 @@
                 <w:szCs w:val="24"/>
               </w:rPr>
             </w:pPr>
+            <w:r>
+              <w:rPr>
+                <w:rFonts w:ascii="Times New Roman" w:hAnsi="Times New Roman" w:cs="Times New Roman"/>
+                <w:sz w:val="24"/>
+              </w:rPr>
+              <w:t vyd:_id="vyd:moljc0rruv4eg0">Изучить материал</w:t>
+            </w:r>
           </w:p>
         </w:tc>
         <w:tc vyd:_id="vyd:0000000000029z">
@@ -2125,6 +2146,13 @@
                 <w:szCs w:val="24"/>
               </w:rPr>
             </w:pPr>
+            <w:r>
+              <w:rPr>
+                <w:rFonts w:ascii="Times New Roman" w:hAnsi="Times New Roman" w:cs="Times New Roman"/>
+                <w:sz w:val="24"/>
+              </w:rPr>
+              <w:t vyd:_id="vyd:molja8d8rdjjas">Решение тригонометрических уравнений</w:t>
+            </w:r>
           </w:p>
         </w:tc>
         <w:tc vyd:_id="vyd:0000000000028n">
@@ -2370,6 +2398,13 @@
                 <w:szCs w:val="24"/>
               </w:rPr>
             </w:pPr>
+            <w:r>
+              <w:rPr>
+                <w:rFonts w:ascii="Times New Roman" w:hAnsi="Times New Roman" w:cs="Times New Roman"/>
+                <w:sz w:val="24"/>
+              </w:rPr>
+              <w:t vyd:_id="vyd:moljamle51j5qf">МАХ</w:t>
+            </w:r>
           </w:p>
         </w:tc>
         <w:tc vyd:_id="vyd:00000000000282">
@@ -2603,6 +2638,13 @@
                 <w:szCs w:val="24"/>
               </w:rPr>
             </w:pPr>
+            <w:r>
+              <w:rPr>
+                <w:rFonts w:ascii="Times New Roman" w:hAnsi="Times New Roman" w:cs="Times New Roman"/>
+                <w:sz w:val="24"/>
+              </w:rPr>
+              <w:t vyd:_id="vyd:moljb138dcfweb">Решить тригонометрические уравнения</w:t>
+            </w:r>
           </w:p>
         </w:tc>
         <w:tc vyd:_id="vyd:0000000000027h">
@@ -16642,6 +16684,25 @@
           <w:p vyd:_id="vyd:0000000000017y">
             <w:pPr>
               <w:pStyle w:val="Normal"/>
+              <w:spacing w:lineRule="auto" w:line="240" w:before="0" w:after="240"/>
+              <w:rPr>
+                <w:rFonts w:ascii="Times New Roman" w:hAnsi="Times New Roman" w:cs="Times New Roman"/>
+                <w:sz w:val="24"/>
+                <w:color w:val="000000"/>
+              </w:rPr>
+            </w:pPr>
+            <w:r>
+              <w:rPr>
+                <w:rFonts w:ascii="Times New Roman" w:hAnsi="Times New Roman" w:cs="Times New Roman"/>
+                <w:sz w:val="24"/>
+                <w:color w:val="000000"/>
+              </w:rPr>
+              <w:t vyd:_id="vyd:molfz3yx252x99">Выполнить практикоориентированное задание</w:t>
+            </w:r>
+          </w:p>
+          <w:p vyd:_id="vyd:molf88lp7j7nu0">
+            <w:pPr>
+              <w:pStyle w:val="Normal"/>
               <w:snapToGrid w:val="0"/>
               <w:spacing w:lineRule="auto" w:line="240" w:before="0" w:after="0"/>
               <w:rPr>
@@ -17735,10 +17796,32 @@
               <w:snapToGrid w:val="0"/>
               <w:spacing w:lineRule="auto" w:line="240" w:before="0" w:after="0"/>
               <w:rPr>
-                <w:rFonts w:ascii="Times New Roman" w:hAnsi="Times New Roman" w:cs="Times New Roman"/>
-                <w:sz w:val="24"/>
                 <w:color w:val="000000"/>
-                <w:szCs w:val="24"/>
+                <w:u w:val="none"/>
+                <w:b w:val="0"/>
+                <w:i w:val="0"/>
+              </w:rPr>
+            </w:pPr>
+            <w:r>
+              <w:rPr>
+                <w:color w:val="000000"/>
+                <w:u w:val="none"/>
+                <w:b w:val="0"/>
+                <w:i w:val="0"/>
+              </w:rPr>
+              <w:t vyd:_id="vyd:molg02ytktcr4e">Выполнить практикоориентированное задание</w:t>
+            </w:r>
+          </w:p>
+          <w:p vyd:_id="vyd:molg0uqealey0g">
+            <w:pPr>
+              <w:pStyle w:val="Normal"/>
+              <w:snapToGrid w:val="0"/>
+              <w:spacing w:lineRule="auto" w:line="240" w:before="0" w:after="0"/>
+              <w:rPr>
+                <w:color w:val="000000"/>
+                <w:u w:val="none"/>
+                <w:b w:val="0"/>
+                <w:i w:val="0"/>
               </w:rPr>
             </w:pPr>
           </w:p>
@@ -22835,6 +22918,13 @@
                 <w:szCs w:val="18"/>
               </w:rPr>
             </w:pPr>
+            <w:r>
+              <w:rPr>
+                <w:rFonts w:ascii="Times New Roman" w:hAnsi="Times New Roman" w:cs="Times New Roman"/>
+                <w:sz w:val="18"/>
+              </w:rPr>
+              <w:t vyd:_id="vyd:moljnow17ivv4j">Нормативно-методическая база ДОУ</w:t>
+            </w:r>
           </w:p>
         </w:tc>
         <w:tc vyd:_id="vyd:000000000000s9">
@@ -23203,6 +23293,13 @@
                 <w:szCs w:val="18"/>
               </w:rPr>
             </w:pPr>
+            <w:r>
+              <w:rPr>
+                <w:rFonts w:ascii="Times New Roman" w:hAnsi="Times New Roman" w:cs="Times New Roman"/>
+                <w:sz w:val="18"/>
+              </w:rPr>
+              <w:t vyd:_id="vyd:moljoisfcc0q64">конспект</w:t>
+            </w:r>
           </w:p>
         </w:tc>
         <w:tc vyd:_id="vyd:000000000000rd">
@@ -23585,6 +23682,13 @@
                 <w:szCs w:val="18"/>
               </w:rPr>
             </w:pPr>
+            <w:r>
+              <w:rPr>
+                <w:rFonts w:ascii="Times New Roman" w:hAnsi="Times New Roman" w:cs="Times New Roman"/>
+                <w:sz w:val="18"/>
+              </w:rPr>
+              <w:t vyd:_id="vyd:moljornfuilnjz">Цели, задачи и к</w:t>
+            </w:r>
           </w:p>
         </w:tc>
         <w:tc vyd:_id="vyd:000000000000qc">
@@ -34063,7 +34167,7 @@
 </file>
 
 <file path=word/footer1.xml><?xml version="1.0" encoding="utf-8"?>
-<w:ftr xmlns:w="http://schemas.openxmlformats.org/wordprocessingml/2006/main" xmlns:vyd="http://volga.yandex.com/schemas/document/model" vyd:_id="vyd:000000000002e6">
+<w:ftr xmlns:vyd="http://volga.yandex.com/schemas/document/model" xmlns:w="http://schemas.openxmlformats.org/wordprocessingml/2006/main" vyd:_id="vyd:000000000002e6">
   <w:p vyd:_id="vyd:000000000002e7">
     <w:pPr>
       <w:pStyle w:val="Footer"/>

</xml_diff>

<commit_message>
Sync schedule files 2026-04-30 15:47
</commit_message>
<xml_diff>
--- a/schedule/02.05.2026 СУББОТА.docx
+++ b/schedule/02.05.2026 СУББОТА.docx
@@ -1,6 +1,6 @@
 
 <file path=word/document.xml><?xml version="1.0" encoding="utf-8"?>
-<w:document xmlns:w="http://schemas.openxmlformats.org/wordprocessingml/2006/main" xmlns:vyd="http://volga.yandex.com/schemas/document/model" xmlns:mc="http://schemas.openxmlformats.org/markup-compatibility/2006" xmlns:r="http://schemas.openxmlformats.org/officeDocument/2006/relationships" w:conformance="transitional" mc:Ignorable="vyd">
+<w:document xmlns:vyd="http://volga.yandex.com/schemas/document/model" xmlns:mc="http://schemas.openxmlformats.org/markup-compatibility/2006" xmlns:r="http://schemas.openxmlformats.org/officeDocument/2006/relationships" xmlns:w="http://schemas.openxmlformats.org/wordprocessingml/2006/main" w:conformance="transitional" mc:Ignorable="vyd">
   <w:background w:color="FFFFFF"/>
   <w:body vyd:_id="vyd:00000000000001">
     <w:p vyd:_id="vyd:000000000002e5">
@@ -3137,6 +3137,13 @@
                 <w:szCs w:val="24"/>
               </w:rPr>
             </w:pPr>
+            <w:r>
+              <w:rPr>
+                <w:rFonts w:ascii="Times New Roman" w:hAnsi="Times New Roman" w:cs="Times New Roman"/>
+                <w:sz w:val="24"/>
+              </w:rPr>
+              <w:t vyd:_id="vyd:molllqfx1bip69">Непредельные у.в(алкены,алкины,алкодиены)</w:t>
+            </w:r>
           </w:p>
         </w:tc>
         <w:tc vyd:_id="vyd:00000000000266">
@@ -3374,6 +3381,13 @@
                 <w:szCs w:val="24"/>
               </w:rPr>
             </w:pPr>
+            <w:r>
+              <w:rPr>
+                <w:rFonts w:ascii="Times New Roman" w:hAnsi="Times New Roman" w:cs="Times New Roman"/>
+                <w:sz w:val="24"/>
+              </w:rPr>
+              <w:t vyd:_id="vyd:mollpuebufhqvt">макс</w:t>
+            </w:r>
           </w:p>
         </w:tc>
         <w:tc vyd:_id="vyd:0000000000025m">
@@ -4115,6 +4129,13 @@
                 <w:szCs w:val="24"/>
               </w:rPr>
             </w:pPr>
+            <w:r>
+              <w:rPr>
+                <w:rFonts w:ascii="Times New Roman" w:hAnsi="Times New Roman" w:cs="Times New Roman"/>
+                <w:sz w:val="24"/>
+              </w:rPr>
+              <w:t vyd:_id="vyd:mollq49gkb2f4m">Циклические  соединения (бензол).</w:t>
+            </w:r>
           </w:p>
         </w:tc>
         <w:tc vyd:_id="vyd:0000000000023p">
@@ -4354,6 +4375,13 @@
                 <w:szCs w:val="24"/>
               </w:rPr>
             </w:pPr>
+            <w:r>
+              <w:rPr>
+                <w:rFonts w:ascii="Times New Roman" w:hAnsi="Times New Roman" w:cs="Times New Roman"/>
+                <w:sz w:val="24"/>
+              </w:rPr>
+              <w:t vyd:_id="vyd:mollryyodbznbs">макс</w:t>
+            </w:r>
           </w:p>
         </w:tc>
         <w:tc vyd:_id="vyd:00000000000235">
@@ -13563,7 +13591,6 @@
     </w:p>
     <w:tbl vyd:_id="vyd:000000000000za">
       <w:tblPr>
-        <w:tblW w:w="15275" w:type="dxa"/>
         <w:jc w:val="center"/>
         <w:tblInd w:w="0" w:type="dxa"/>
         <w:tblLayout w:type="fixed"/>
@@ -13582,8 +13609,8 @@
         <w:gridCol w:w="1984"/>
         <w:gridCol w:w="1984"/>
         <w:gridCol w:w="1984"/>
-        <w:gridCol w:w="1984"/>
-        <w:gridCol w:w="1984"/>
+        <w:gridCol w:w="2057.5"/>
+        <w:gridCol w:w="1910.5"/>
       </w:tblGrid>
       <w:tr vyd:_id="vyd:000000000001ex">
         <w:trPr>
@@ -14524,14 +14551,27 @@
           <w:p vyd:_id="vyd:000000000001d6">
             <w:pPr>
               <w:pStyle w:val="Normal"/>
-              <w:snapToGrid w:val="0"/>
-              <w:spacing w:lineRule="auto" w:line="240" w:before="0" w:after="0"/>
-              <w:rPr>
-                <w:rFonts w:ascii="Times New Roman" w:hAnsi="Times New Roman" w:cs="Times New Roman"/>
-                <w:sz w:val="24"/>
-                <w:szCs w:val="24"/>
-              </w:rPr>
-            </w:pPr>
+              <w:spacing w:lineRule="auto" w:line="240" w:before="0" w:after="0"/>
+              <w:rPr>
+                <w:rFonts w:ascii="Times New Roman" w:hAnsi="Times New Roman" w:cs="Times New Roman"/>
+                <w:sz w:val="22"/>
+                <w:szCs w:val="24"/>
+              </w:rPr>
+            </w:pPr>
+            <w:r>
+              <w:rPr>
+                <w:rFonts w:ascii="Times New Roman" w:hAnsi="Times New Roman" w:cs="Times New Roman"/>
+                <w:sz w:val="22"/>
+              </w:rPr>
+              <w:t vyd:_id="vyd:molmbhzn3s9zmj" xml:space="preserve">Место и роль СССР в послевоенном мире. </w:t>
+            </w:r>
+            <w:r>
+              <w:rPr>
+                <w:rFonts w:ascii="Times New Roman" w:hAnsi="Times New Roman" w:cs="Times New Roman"/>
+                <w:sz w:val="22"/>
+              </w:rPr>
+              <w:t vyd:_id="vyd:molmbhz0fbzkoa">Внешняя политика СССР в 1945—1953 гг.</w:t>
+            </w:r>
           </w:p>
         </w:tc>
         <w:tc vyd:_id="vyd:000000000001d3">
@@ -14792,6 +14832,13 @@
                 <w:szCs w:val="24"/>
               </w:rPr>
             </w:pPr>
+            <w:r>
+              <w:rPr>
+                <w:rFonts w:ascii="Times New Roman" w:hAnsi="Times New Roman" w:cs="Times New Roman"/>
+                <w:sz w:val="24"/>
+              </w:rPr>
+              <w:t vyd:_id="vyd:molmbsyu9b3o23">мах</w:t>
+            </w:r>
           </w:p>
         </w:tc>
         <w:tc vyd:_id="vyd:000000000001cj">
@@ -15024,6 +15071,19 @@
                 <w:szCs w:val="24"/>
               </w:rPr>
             </w:pPr>
+            <w:r>
+              <w:rPr>
+                <w:rFonts w:ascii="Times New Roman" w:hAnsi="Times New Roman" w:cs="Times New Roman"/>
+                <w:sz w:val="22"/>
+              </w:rPr>
+              <w:t vyd:_id="vyd:molmcov9yyqvpb" xml:space="preserve">Составить конспект по учебнику истории 11 класс Мединского В.Р. Параграф 4. Подпункт 1 </w:t>
+            </w:r>
+            <w:r>
+              <w:rPr>
+                <w:rFonts w:ascii="Times New Roman" w:hAnsi="Times New Roman" w:cs="Times New Roman"/>
+              </w:rPr>
+              <w:t vyd:_id="vyd:molmgdwanndytu">Укрепление геополитических позиций СССР.</w:t>
+            </w:r>
           </w:p>
         </w:tc>
         <w:tc vyd:_id="vyd:000000000001bz">
@@ -15560,6 +15620,30 @@
           <w:p vyd:_id="vyd:000000000001an">
             <w:pPr>
               <w:pStyle w:val="Normal"/>
+              <w:spacing w:lineRule="auto" w:line="240" w:before="0" w:after="0"/>
+              <w:rPr>
+                <w:rFonts w:ascii="Times New Roman" w:hAnsi="Times New Roman" w:cs="Times New Roman"/>
+                <w:sz w:val="22"/>
+              </w:rPr>
+            </w:pPr>
+            <w:r>
+              <w:rPr>
+                <w:rFonts w:ascii="Times New Roman" w:hAnsi="Times New Roman" w:cs="Times New Roman"/>
+                <w:sz w:val="22"/>
+              </w:rPr>
+              <w:t vyd:_id="vyd:molmc3woi7kz76" xml:space="preserve">Место и роль СССР в послевоенном мире. </w:t>
+            </w:r>
+            <w:r>
+              <w:rPr>
+                <w:rFonts w:ascii="Times New Roman" w:hAnsi="Times New Roman" w:cs="Times New Roman"/>
+                <w:sz w:val="22"/>
+              </w:rPr>
+              <w:t vyd:_id="vyd:molmc3wmz02okw">Внешняя политика СССР в 1945—1953 гг.</w:t>
+            </w:r>
+          </w:p>
+          <w:p vyd:_id="vyd:molmc3wiumnxi8">
+            <w:pPr>
+              <w:pStyle w:val="Normal"/>
               <w:snapToGrid w:val="0"/>
               <w:spacing w:lineRule="auto" w:line="240" w:before="0" w:after="0"/>
               <w:rPr>
@@ -15800,6 +15884,13 @@
                 <w:szCs w:val="24"/>
               </w:rPr>
             </w:pPr>
+            <w:r>
+              <w:rPr>
+                <w:rFonts w:ascii="Times New Roman" w:hAnsi="Times New Roman" w:cs="Times New Roman"/>
+                <w:sz w:val="24"/>
+              </w:rPr>
+              <w:t vyd:_id="vyd:molmikqb6kggb0">мах</w:t>
+            </w:r>
           </w:p>
         </w:tc>
         <w:tc vyd:_id="vyd:000000000001a0">
@@ -16034,14 +16125,20 @@
           <w:p vyd:_id="vyd:0000000000019j">
             <w:pPr>
               <w:pStyle w:val="Normal"/>
-              <w:snapToGrid w:val="0"/>
-              <w:spacing w:lineRule="auto" w:line="240" w:before="0" w:after="0"/>
-              <w:rPr>
-                <w:rFonts w:ascii="Times New Roman" w:hAnsi="Times New Roman" w:cs="Times New Roman"/>
-                <w:sz w:val="24"/>
-                <w:szCs w:val="24"/>
-              </w:rPr>
-            </w:pPr>
+              <w:spacing w:lineRule="auto" w:line="240" w:before="0" w:after="0"/>
+              <w:rPr>
+                <w:rFonts w:ascii="Times New Roman" w:hAnsi="Times New Roman" w:cs="Times New Roman"/>
+                <w:sz w:val="24"/>
+                <w:szCs w:val="24"/>
+              </w:rPr>
+            </w:pPr>
+            <w:r>
+              <w:rPr>
+                <w:rFonts w:ascii="Times New Roman" w:hAnsi="Times New Roman" w:cs="Times New Roman"/>
+                <w:sz w:val="22"/>
+              </w:rPr>
+              <w:t vyd:_id="vyd:molmgohlinys8n" xml:space="preserve">Составить конспект по учебнику истории 11 класс Мединского В.Р. Параграф 4. Подпункт 2 Послевоенные договоры с побежденными противниками </w:t>
+            </w:r>
           </w:p>
         </w:tc>
         <w:tc vyd:_id="vyd:0000000000019g">
@@ -16786,12 +16883,19 @@
                 <w:szCs w:val="24"/>
               </w:rPr>
             </w:pPr>
+            <w:r>
+              <w:rPr>
+                <w:rFonts w:ascii="Times New Roman" w:hAnsi="Times New Roman" w:cs="Times New Roman"/>
+                <w:sz w:val="24"/>
+              </w:rPr>
+              <w:t vyd:_id="vyd:molmnu1ev91nxs">СССР и мировое сообщество в 1929—1939 гг.</w:t>
+            </w:r>
           </w:p>
         </w:tc>
       </w:tr>
       <w:tr vyd:_id="vyd:00000000000176">
         <w:trPr>
-          <w:trHeight w:val="23" w:hRule="atLeast"/>
+          <w:trHeight w:val="367.786" w:hRule="atLeast"/>
         </w:trPr>
         <w:tc vyd:_id="vyd:0000000000017o">
           <w:tcPr>
@@ -17032,6 +17136,13 @@
                 <w:szCs w:val="24"/>
               </w:rPr>
             </w:pPr>
+            <w:r>
+              <w:rPr>
+                <w:rFonts w:ascii="Times New Roman" w:hAnsi="Times New Roman" w:cs="Times New Roman"/>
+                <w:sz w:val="24"/>
+              </w:rPr>
+              <w:t vyd:_id="vyd:molmpcu22hzjac">мах</w:t>
+            </w:r>
           </w:p>
         </w:tc>
       </w:tr>
@@ -17270,14 +17381,42 @@
           <w:p vyd:_id="vyd:0000000000016o">
             <w:pPr>
               <w:pStyle w:val="Normal"/>
-              <w:snapToGrid w:val="0"/>
-              <w:spacing w:lineRule="auto" w:line="240" w:before="0" w:after="0"/>
-              <w:rPr>
-                <w:rFonts w:ascii="Times New Roman" w:hAnsi="Times New Roman" w:cs="Times New Roman"/>
-                <w:sz w:val="24"/>
-                <w:szCs w:val="24"/>
-              </w:rPr>
-            </w:pPr>
+              <w:spacing w:lineRule="auto" w:line="240" w:before="0" w:after="0"/>
+              <w:rPr>
+                <w:rFonts w:ascii="Times New Roman" w:hAnsi="Times New Roman" w:cs="Times New Roman"/>
+              </w:rPr>
+            </w:pPr>
+            <w:r>
+              <w:rPr>
+                <w:rFonts w:ascii="Times New Roman" w:hAnsi="Times New Roman" w:cs="Times New Roman"/>
+                <w:sz w:val="22"/>
+              </w:rPr>
+              <w:t vyd:_id="vyd:molmjkon2yam1k" xml:space="preserve">Составить конспект по учебнику истории 10 класс Мединского В.Р. Параграф  27 Подпункт 2 </w:t>
+            </w:r>
+            <w:r>
+              <w:rPr>
+                <w:rFonts w:ascii="Times New Roman" w:hAnsi="Times New Roman" w:cs="Times New Roman"/>
+              </w:rPr>
+              <w:t vyd:_id="vyd:molmn2ez9wt8yw">СССР и мировое сообщество. Борьба за создание системы</w:t>
+            </w:r>
+          </w:p>
+          <w:p vyd:_id="vyd:molmn2eue4tbdd">
+            <w:pPr>
+              <w:pStyle w:val="Normal"/>
+              <w:snapToGrid w:val="0"/>
+              <w:spacing w:lineRule="auto" w:line="240" w:before="0" w:after="0"/>
+              <w:rPr>
+                <w:rFonts w:ascii="Times New Roman" w:hAnsi="Times New Roman" w:cs="Times New Roman"/>
+                <w:sz w:val="24"/>
+                <w:szCs w:val="24"/>
+              </w:rPr>
+            </w:pPr>
+            <w:r>
+              <w:rPr>
+                <w:rFonts w:ascii="Times New Roman" w:hAnsi="Times New Roman" w:cs="Times New Roman"/>
+              </w:rPr>
+              <w:t vyd:_id="vyd:molmn2e8r8txws">коллективной безопасности.</w:t>
+            </w:r>
           </w:p>
         </w:tc>
       </w:tr>
@@ -17898,6 +18037,13 @@
                 <w:szCs w:val="24"/>
               </w:rPr>
             </w:pPr>
+            <w:r>
+              <w:rPr>
+                <w:rFonts w:ascii="Times New Roman" w:hAnsi="Times New Roman" w:cs="Times New Roman"/>
+                <w:sz w:val="24"/>
+              </w:rPr>
+              <w:t vyd:_id="vyd:molmo4p0tfk898">СССР и мировое сообщество в 1929—1939 гг.</w:t>
+            </w:r>
           </w:p>
         </w:tc>
       </w:tr>
@@ -18144,6 +18290,13 @@
                 <w:szCs w:val="24"/>
               </w:rPr>
             </w:pPr>
+            <w:r>
+              <w:rPr>
+                <w:rFonts w:ascii="Times New Roman" w:hAnsi="Times New Roman" w:cs="Times New Roman"/>
+                <w:sz w:val="24"/>
+              </w:rPr>
+              <w:t vyd:_id="vyd:molmp2om1k9flc">мах</w:t>
+            </w:r>
           </w:p>
         </w:tc>
       </w:tr>
@@ -18387,9 +18540,23 @@
               <w:rPr>
                 <w:rFonts w:ascii="Times New Roman" w:hAnsi="Times New Roman" w:cs="Times New Roman"/>
                 <w:sz w:val="24"/>
-                <w:szCs w:val="24"/>
-              </w:rPr>
-            </w:pPr>
+                <w:b w:val="1"/>
+                <w:szCs w:val="24"/>
+              </w:rPr>
+            </w:pPr>
+            <w:r>
+              <w:rPr>
+                <w:rFonts w:ascii="Times New Roman" w:hAnsi="Times New Roman" w:cs="Times New Roman"/>
+                <w:sz w:val="22"/>
+              </w:rPr>
+              <w:t vyd:_id="vyd:molmjcpgbbrc01" xml:space="preserve">Составить конспект по учебнику истории 10 класс Мединского В.Р. Параграф 27 Подпункт 4 </w:t>
+            </w:r>
+            <w:r>
+              <w:rPr>
+                <w:rFonts w:ascii="Times New Roman" w:hAnsi="Times New Roman" w:cs="Times New Roman"/>
+              </w:rPr>
+              <w:t vyd:_id="vyd:molmozu07pgmfk">Укрепление безопасности на Дальнем Востоке.</w:t>
+            </w:r>
           </w:p>
         </w:tc>
       </w:tr>
@@ -23687,7 +23854,7 @@
                 <w:rFonts w:ascii="Times New Roman" w:hAnsi="Times New Roman" w:cs="Times New Roman"/>
                 <w:sz w:val="18"/>
               </w:rPr>
-              <w:t vyd:_id="vyd:moljornfuilnjz">Цели, задачи и к</w:t>
+              <w:t vyd:_id="vyd:moljornfuilnjz">Цели, задачи и функции  предпринимательской деятельности</w:t>
             </w:r>
           </w:p>
         </w:tc>
@@ -24062,6 +24229,13 @@
                 <w:szCs w:val="18"/>
               </w:rPr>
             </w:pPr>
+            <w:r>
+              <w:rPr>
+                <w:rFonts w:ascii="Times New Roman" w:hAnsi="Times New Roman" w:cs="Times New Roman"/>
+                <w:sz w:val="18"/>
+              </w:rPr>
+              <w:t vyd:_id="vyd:moljpy6bly0so7">конспект</w:t>
+            </w:r>
           </w:p>
         </w:tc>
         <w:tc vyd:_id="vyd:000000000000pg">

</xml_diff>

<commit_message>
Sync schedule files 2026-04-30 19:21
</commit_message>
<xml_diff>
--- a/schedule/02.05.2026 СУББОТА.docx
+++ b/schedule/02.05.2026 СУББОТА.docx
@@ -1,6 +1,6 @@
 
 <file path=word/document.xml><?xml version="1.0" encoding="utf-8"?>
-<w:document xmlns:vyd="http://volga.yandex.com/schemas/document/model" xmlns:mc="http://schemas.openxmlformats.org/markup-compatibility/2006" xmlns:r="http://schemas.openxmlformats.org/officeDocument/2006/relationships" xmlns:w="http://schemas.openxmlformats.org/wordprocessingml/2006/main" w:conformance="transitional" mc:Ignorable="vyd">
+<w:document xmlns:r="http://schemas.openxmlformats.org/officeDocument/2006/relationships" xmlns:mc="http://schemas.openxmlformats.org/markup-compatibility/2006" xmlns:vyd="http://volga.yandex.com/schemas/document/model" xmlns:w="http://schemas.openxmlformats.org/wordprocessingml/2006/main" w:conformance="transitional" mc:Ignorable="vyd">
   <w:background w:color="FFFFFF"/>
   <w:body vyd:_id="vyd:00000000000001">
     <w:p vyd:_id="vyd:000000000002e5">
@@ -9854,6 +9854,13 @@
                 <w:szCs w:val="20"/>
               </w:rPr>
             </w:pPr>
+            <w:r>
+              <w:rPr>
+                <w:rFonts w:ascii="Times New Roman" w:hAnsi="Times New Roman" w:cs="Times New Roman"/>
+                <w:sz w:val="20"/>
+              </w:rPr>
+              <w:t vyd:_id="vyd:molr69igg5zc0p">Правила игры в настольный теннис</w:t>
+            </w:r>
           </w:p>
         </w:tc>
         <w:tc vyd:_id="vyd:000000000001p4">
@@ -10087,6 +10094,13 @@
                 <w:szCs w:val="20"/>
               </w:rPr>
             </w:pPr>
+            <w:r>
+              <w:rPr>
+                <w:rFonts w:ascii="Times New Roman" w:hAnsi="Times New Roman" w:cs="Times New Roman"/>
+                <w:sz w:val="20"/>
+              </w:rPr>
+              <w:t vyd:_id="vyd:molr634oslhotg">Max</w:t>
+            </w:r>
           </w:p>
         </w:tc>
         <w:tc vyd:_id="vyd:000000000001oj">
@@ -10831,6 +10845,13 @@
                 <w:szCs w:val="20"/>
               </w:rPr>
             </w:pPr>
+            <w:r>
+              <w:rPr>
+                <w:rFonts w:ascii="Times New Roman" w:hAnsi="Times New Roman" w:cs="Times New Roman"/>
+                <w:sz w:val="20"/>
+              </w:rPr>
+              <w:t vyd:_id="vyd:molr41h30oh8cf">Правила игры в бадминтон</w:t>
+            </w:r>
           </w:p>
         </w:tc>
         <w:tc vyd:_id="vyd:000000000001ml">
@@ -11059,6 +11080,13 @@
                 <w:szCs w:val="20"/>
               </w:rPr>
             </w:pPr>
+            <w:r>
+              <w:rPr>
+                <w:rFonts w:ascii="Times New Roman" w:hAnsi="Times New Roman" w:cs="Times New Roman"/>
+                <w:sz w:val="20"/>
+              </w:rPr>
+              <w:t vyd:_id="vyd:molr5cvwr6dwyl" xml:space="preserve"> Max</w:t>
+            </w:r>
           </w:p>
         </w:tc>
         <w:tc vyd:_id="vyd:000000000001m1">
@@ -11436,6 +11464,207 @@
             </w:tcBorders>
           </w:tcPr>
           <w:p vyd:_id="vyd:000000000001l8">
+            <w:pPr>
+              <w:pStyle w:val="Normal"/>
+              <w:snapToGrid w:val="0"/>
+              <w:spacing w:lineRule="auto" w:line="240" w:before="0" w:after="0"/>
+              <w:rPr>
+                <w:rFonts w:ascii="Times New Roman" w:hAnsi="Times New Roman" w:cs="Times New Roman"/>
+                <w:sz w:val="24"/>
+                <w:szCs w:val="24"/>
+              </w:rPr>
+            </w:pPr>
+          </w:p>
+        </w:tc>
+      </w:tr>
+      <w:tr vyd:_id="vyd:molr4u7nhqujh9">
+        <w:trPr>
+          <w:trHeight w:val="23" w:hRule="atLeast"/>
+        </w:trPr>
+        <w:tc vyd:_id="vyd:molr4u85jnptyf">
+          <w:tcPr>
+            <w:tcBorders>
+              <w:top w:val="single" w:color="000000" w:sz="4" w:space="0"/>
+              <w:start w:val="single" w:color="000000" w:sz="4" w:space="0"/>
+              <w:bottom w:val="single" w:color="000000" w:sz="4" w:space="0"/>
+              <w:end w:val="single" w:color="000000" w:sz="4" w:space="0"/>
+            </w:tcBorders>
+          </w:tcPr>
+          <w:p vyd:_id="vyd:molr4u7qmbxwl7">
+            <w:pPr>
+              <w:pStyle w:val="Normal"/>
+              <w:snapToGrid w:val="0"/>
+              <w:spacing w:lineRule="auto" w:line="240" w:before="0" w:after="0"/>
+              <w:rPr>
+                <w:rFonts w:ascii="Times New Roman" w:hAnsi="Times New Roman" w:cs="Times New Roman"/>
+                <w:sz w:val="24"/>
+                <w:lang w:val="en-US"/>
+                <w:szCs w:val="24"/>
+              </w:rPr>
+            </w:pPr>
+          </w:p>
+        </w:tc>
+        <w:tc vyd:_id="vyd:molr4u8xxsoijt">
+          <w:tcPr>
+            <w:tcBorders>
+              <w:top w:val="single" w:color="000000" w:sz="4" w:space="0"/>
+              <w:start w:val="single" w:color="000000" w:sz="4" w:space="0"/>
+              <w:bottom w:val="single" w:color="000000" w:sz="4" w:space="0"/>
+              <w:end w:val="single" w:color="000000" w:sz="4" w:space="0"/>
+            </w:tcBorders>
+          </w:tcPr>
+          <w:p vyd:_id="vyd:molr4u8f9mrnm1">
+            <w:pPr>
+              <w:pStyle w:val="Normal"/>
+              <w:spacing w:lineRule="auto" w:line="240" w:before="0" w:after="0"/>
+              <w:rPr>
+                <w:rFonts w:ascii="Times New Roman" w:hAnsi="Times New Roman" w:cs="Times New Roman"/>
+                <w:sz w:val="14"/>
+              </w:rPr>
+            </w:pPr>
+          </w:p>
+        </w:tc>
+        <w:tc vyd:_id="vyd:molr4u9eddsozg">
+          <w:tcPr>
+            <w:tcBorders>
+              <w:top w:val="single" w:color="000000" w:sz="4" w:space="0"/>
+              <w:start w:val="single" w:color="000000" w:sz="4" w:space="0"/>
+              <w:bottom w:val="single" w:color="000000" w:sz="4" w:space="0"/>
+              <w:end w:val="single" w:color="000000" w:sz="4" w:space="0"/>
+            </w:tcBorders>
+          </w:tcPr>
+          <w:p vyd:_id="vyd:molr4u961t6afw">
+            <w:pPr>
+              <w:pStyle w:val="Normal"/>
+              <w:snapToGrid w:val="0"/>
+              <w:spacing w:lineRule="auto" w:line="240" w:before="0" w:after="0"/>
+              <w:rPr>
+                <w:rFonts w:ascii="Times New Roman" w:hAnsi="Times New Roman" w:cs="Times New Roman"/>
+                <w:sz w:val="20"/>
+                <w:szCs w:val="20"/>
+              </w:rPr>
+            </w:pPr>
+          </w:p>
+        </w:tc>
+        <w:tc vyd:_id="vyd:molr4u9sofux3o">
+          <w:tcPr>
+            <w:tcBorders>
+              <w:top w:val="single" w:color="000000" w:sz="4" w:space="0"/>
+              <w:start w:val="single" w:color="000000" w:sz="4" w:space="0"/>
+              <w:bottom w:val="single" w:color="000000" w:sz="4" w:space="0"/>
+              <w:end w:val="single" w:color="000000" w:sz="4" w:space="0"/>
+            </w:tcBorders>
+          </w:tcPr>
+          <w:p vyd:_id="vyd:molr4u9ozc5vod">
+            <w:pPr>
+              <w:pStyle w:val="Normal"/>
+              <w:snapToGrid w:val="0"/>
+              <w:spacing w:lineRule="auto" w:line="240" w:before="0" w:after="0"/>
+              <w:rPr>
+                <w:rFonts w:ascii="Times New Roman" w:hAnsi="Times New Roman" w:cs="Times New Roman"/>
+                <w:sz w:val="24"/>
+                <w:szCs w:val="24"/>
+              </w:rPr>
+            </w:pPr>
+          </w:p>
+        </w:tc>
+        <w:tc vyd:_id="vyd:molr4ubtdmwc5i">
+          <w:tcPr>
+            <w:tcBorders>
+              <w:top w:val="single" w:color="000000" w:sz="4" w:space="0"/>
+              <w:start w:val="single" w:color="000000" w:sz="4" w:space="0"/>
+              <w:bottom w:val="single" w:color="000000" w:sz="4" w:space="0"/>
+              <w:end w:val="single" w:color="000000" w:sz="4" w:space="0"/>
+            </w:tcBorders>
+          </w:tcPr>
+          <w:p vyd:_id="vyd:molr4ubpysuisd">
+            <w:pPr>
+              <w:pStyle w:val="Normal"/>
+              <w:snapToGrid w:val="0"/>
+              <w:spacing w:lineRule="auto" w:line="240" w:before="0" w:after="0"/>
+              <w:rPr>
+                <w:rFonts w:ascii="Times New Roman" w:hAnsi="Times New Roman" w:cs="Times New Roman"/>
+                <w:sz w:val="24"/>
+                <w:color w:val="FF0000"/>
+                <w:szCs w:val="24"/>
+              </w:rPr>
+            </w:pPr>
+          </w:p>
+        </w:tc>
+        <w:tc vyd:_id="vyd:molr4uc32adp55">
+          <w:tcPr>
+            <w:tcBorders>
+              <w:top w:val="single" w:color="000000" w:sz="4" w:space="0"/>
+              <w:start w:val="single" w:color="000000" w:sz="4" w:space="0"/>
+              <w:bottom w:val="single" w:color="000000" w:sz="4" w:space="0"/>
+              <w:end w:val="single" w:color="000000" w:sz="4" w:space="0"/>
+            </w:tcBorders>
+          </w:tcPr>
+          <w:p vyd:_id="vyd:molr4ubybf31pq">
+            <w:pPr>
+              <w:pStyle w:val="Normal"/>
+              <w:spacing w:lineRule="auto" w:line="240" w:before="0" w:after="0"/>
+              <w:rPr>
+                <w:rFonts w:ascii="Times New Roman" w:hAnsi="Times New Roman" w:cs="Times New Roman"/>
+                <w:sz w:val="24"/>
+              </w:rPr>
+            </w:pPr>
+          </w:p>
+        </w:tc>
+        <w:tc vyd:_id="vyd:molr4uccgb6xqp">
+          <w:tcPr>
+            <w:tcBorders>
+              <w:top w:val="single" w:color="000000" w:sz="4" w:space="0"/>
+              <w:start w:val="single" w:color="000000" w:sz="4" w:space="0"/>
+              <w:bottom w:val="single" w:color="000000" w:sz="4" w:space="0"/>
+              <w:end w:val="single" w:color="000000" w:sz="4" w:space="0"/>
+            </w:tcBorders>
+          </w:tcPr>
+          <w:p vyd:_id="vyd:molr4uc8vwurc2">
+            <w:pPr>
+              <w:pStyle w:val="Normal"/>
+              <w:snapToGrid w:val="0"/>
+              <w:spacing w:lineRule="auto" w:line="240" w:before="0" w:after="0"/>
+              <w:rPr>
+                <w:rFonts w:ascii="Times New Roman" w:hAnsi="Times New Roman" w:cs="Times New Roman"/>
+                <w:sz w:val="24"/>
+                <w:szCs w:val="24"/>
+              </w:rPr>
+            </w:pPr>
+          </w:p>
+        </w:tc>
+        <w:tc vyd:_id="vyd:molr4uclf9t0t5">
+          <w:tcPr>
+            <w:tcBorders>
+              <w:top w:val="single" w:color="000000" w:sz="4" w:space="0"/>
+              <w:start w:val="single" w:color="000000" w:sz="4" w:space="0"/>
+              <w:bottom w:val="single" w:color="000000" w:sz="4" w:space="0"/>
+              <w:end w:val="single" w:color="000000" w:sz="4" w:space="0"/>
+            </w:tcBorders>
+          </w:tcPr>
+          <w:p vyd:_id="vyd:molr4uch5loytt">
+            <w:pPr>
+              <w:pStyle w:val="Normal"/>
+              <w:snapToGrid w:val="0"/>
+              <w:spacing w:lineRule="auto" w:line="240" w:before="0" w:after="0"/>
+              <w:rPr>
+                <w:rFonts w:ascii="Times New Roman" w:hAnsi="Times New Roman" w:cs="Times New Roman"/>
+                <w:sz w:val="24"/>
+                <w:szCs w:val="24"/>
+              </w:rPr>
+            </w:pPr>
+          </w:p>
+        </w:tc>
+        <w:tc vyd:_id="vyd:molr4ucvma6zzl">
+          <w:tcPr>
+            <w:tcBorders>
+              <w:top w:val="single" w:color="000000" w:sz="4" w:space="0"/>
+              <w:start w:val="single" w:color="000000" w:sz="4" w:space="0"/>
+              <w:bottom w:val="single" w:color="000000" w:sz="4" w:space="0"/>
+              <w:end w:val="single" w:color="000000" w:sz="4" w:space="0"/>
+            </w:tcBorders>
+          </w:tcPr>
+          <w:p vyd:_id="vyd:molr4ucq1smbwf">
             <w:pPr>
               <w:pStyle w:val="Normal"/>
               <w:snapToGrid w:val="0"/>
@@ -22360,6 +22589,13 @@
                 <w:szCs w:val="18"/>
               </w:rPr>
             </w:pPr>
+            <w:r>
+              <w:rPr>
+                <w:rFonts w:ascii="Times New Roman" w:hAnsi="Times New Roman" w:cs="Times New Roman"/>
+                <w:sz w:val="18"/>
+              </w:rPr>
+              <w:t vyd:_id="vyd:molra72mwkh4nc">Правила игры в баскетбол</w:t>
+            </w:r>
           </w:p>
         </w:tc>
         <w:tc vyd:_id="vyd:000000000000u4">
@@ -22568,6 +22804,13 @@
                 <w:szCs w:val="18"/>
               </w:rPr>
             </w:pPr>
+            <w:r>
+              <w:rPr>
+                <w:rFonts w:ascii="Times New Roman" w:hAnsi="Times New Roman" w:cs="Times New Roman"/>
+                <w:sz w:val="18"/>
+              </w:rPr>
+              <w:t vyd:_id="vyd:molrbavlx2pe1v">Max</w:t>
+            </w:r>
           </w:p>
         </w:tc>
         <w:tc vyd:_id="vyd:000000000000tn">
@@ -34341,7 +34584,7 @@
 </file>
 
 <file path=word/footer1.xml><?xml version="1.0" encoding="utf-8"?>
-<w:ftr xmlns:vyd="http://volga.yandex.com/schemas/document/model" xmlns:w="http://schemas.openxmlformats.org/wordprocessingml/2006/main" vyd:_id="vyd:000000000002e6">
+<w:ftr xmlns:w="http://schemas.openxmlformats.org/wordprocessingml/2006/main" xmlns:vyd="http://volga.yandex.com/schemas/document/model" vyd:_id="vyd:000000000002e6">
   <w:p vyd:_id="vyd:000000000002e7">
     <w:pPr>
       <w:pStyle w:val="Footer"/>

</xml_diff>

<commit_message>
Sync schedule files 2026-05-01 11:05
</commit_message>
<xml_diff>
--- a/schedule/02.05.2026 СУББОТА.docx
+++ b/schedule/02.05.2026 СУББОТА.docx
@@ -1,6 +1,6 @@
 
 <file path=word/document.xml><?xml version="1.0" encoding="utf-8"?>
-<w:document xmlns:r="http://schemas.openxmlformats.org/officeDocument/2006/relationships" xmlns:mc="http://schemas.openxmlformats.org/markup-compatibility/2006" xmlns:vyd="http://volga.yandex.com/schemas/document/model" xmlns:w="http://schemas.openxmlformats.org/wordprocessingml/2006/main" w:conformance="transitional" mc:Ignorable="vyd">
+<w:document xmlns:mc="http://schemas.openxmlformats.org/markup-compatibility/2006" xmlns:vyd="http://volga.yandex.com/schemas/document/model" xmlns:w="http://schemas.openxmlformats.org/wordprocessingml/2006/main" xmlns:r="http://schemas.openxmlformats.org/officeDocument/2006/relationships" w:conformance="transitional" mc:Ignorable="vyd">
   <w:background w:color="FFFFFF"/>
   <w:body vyd:_id="vyd:00000000000001">
     <w:p vyd:_id="vyd:000000000002e5">
@@ -3037,11 +3037,36 @@
               <w:snapToGrid w:val="0"/>
               <w:spacing w:lineRule="auto" w:line="240" w:before="0" w:after="0"/>
               <w:rPr>
-                <w:rFonts w:ascii="Times New Roman" w:hAnsi="Times New Roman" w:cs="Times New Roman"/>
-                <w:sz w:val="24"/>
-                <w:szCs w:val="24"/>
-              </w:rPr>
-            </w:pPr>
+                <w:rFonts w:ascii="Times New Roman" w:hAnsi="Times New Roman" w:eastAsia="Times New Roman" w:cs="Times New Roman"/>
+                <w:sz w:val="20"/>
+              </w:rPr>
+            </w:pPr>
+            <w:r>
+              <w:rPr>
+                <w:rFonts w:ascii="Times New Roman" w:hAnsi="Times New Roman" w:eastAsia="Times New Roman" w:cs="Times New Roman"/>
+                <w:sz w:val="20"/>
+              </w:rPr>
+              <w:t vyd:_id="vyd:momox5u2p5wqtt">Проект как вид самостоятельной творческой работы.</w:t>
+            </w:r>
+          </w:p>
+          <w:p vyd:_id="vyd:momox73qd6c4k6">
+            <w:pPr>
+              <w:pStyle w:val="Normal"/>
+              <w:snapToGrid w:val="0"/>
+              <w:spacing w:lineRule="auto" w:line="240" w:before="0" w:after="0"/>
+              <w:rPr>
+                <w:rFonts w:ascii="Times New Roman" w:hAnsi="Times New Roman" w:cs="Times New Roman"/>
+                <w:sz w:val="24"/>
+                <w:szCs w:val="24"/>
+              </w:rPr>
+            </w:pPr>
+            <w:r>
+              <w:rPr>
+                <w:rFonts w:ascii="Times New Roman" w:hAnsi="Times New Roman" w:eastAsia="Times New Roman" w:cs="Times New Roman"/>
+                <w:sz w:val="20"/>
+              </w:rPr>
+              <w:t vyd:_id="vyd:momowk2kypqqfu">Определение понятия «проект». Мотивация проектной деятельности.</w:t>
+            </w:r>
           </w:p>
         </w:tc>
         <w:tc vyd:_id="vyd:0000000000026e">
@@ -3274,6 +3299,13 @@
                 <w:szCs w:val="24"/>
               </w:rPr>
             </w:pPr>
+            <w:r>
+              <w:rPr>
+                <w:rFonts w:ascii="Times New Roman" w:hAnsi="Times New Roman" w:eastAsia="Times New Roman" w:cs="Times New Roman"/>
+                <w:sz w:val="18"/>
+              </w:rPr>
+              <w:t vyd:_id="vyd:momoy6i2hgw1b3">MAX</w:t>
+            </w:r>
           </w:p>
         </w:tc>
         <w:tc vyd:_id="vyd:0000000000025u">
@@ -3958,7 +3990,7 @@
       </w:tr>
       <w:tr vyd:_id="vyd:0000000000023m">
         <w:trPr>
-          <w:trHeight w:val="780.049" w:hRule="atLeast"/>
+          <w:trHeight w:val="1848.226" w:hRule="atLeast"/>
         </w:trPr>
         <w:tc vyd:_id="vyd:00000000000244">
           <w:tcPr>
@@ -4027,11 +4059,77 @@
               <w:snapToGrid w:val="0"/>
               <w:spacing w:lineRule="auto" w:line="240" w:before="0" w:after="0"/>
               <w:rPr>
-                <w:rFonts w:ascii="Times New Roman" w:hAnsi="Times New Roman" w:cs="Times New Roman"/>
-                <w:sz w:val="24"/>
-                <w:szCs w:val="24"/>
-              </w:rPr>
-            </w:pPr>
+                <w:rFonts w:ascii="Times New Roman" w:hAnsi="Times New Roman" w:eastAsia="Times New Roman" w:cs="Times New Roman"/>
+                <w:sz w:val="20"/>
+              </w:rPr>
+            </w:pPr>
+            <w:r>
+              <w:rPr>
+                <w:rFonts w:ascii="Times New Roman" w:hAnsi="Times New Roman" w:eastAsia="Times New Roman" w:cs="Times New Roman"/>
+                <w:sz w:val="20"/>
+              </w:rPr>
+              <w:t vyd:_id="vyd:momoyjgqcr1dqq">Различие между</w:t>
+            </w:r>
+            <w:r>
+              <w:rPr>
+                <w:rFonts w:ascii="Times New Roman" w:hAnsi="Times New Roman" w:eastAsia="Times New Roman" w:cs="Times New Roman"/>
+                <w:sz w:val="20"/>
+              </w:rPr>
+              <w:t vyd:_id="vyd:momoyjgp04vl4y" xml:space="preserve">  </w:t>
+            </w:r>
+            <w:r>
+              <w:rPr>
+                <w:rFonts w:ascii="Times New Roman" w:hAnsi="Times New Roman" w:eastAsia="Times New Roman" w:cs="Times New Roman"/>
+                <w:sz w:val="20"/>
+              </w:rPr>
+              <w:t vyd:_id="vyd:momoyjgovuoywg">проектной и исследовательской</w:t>
+            </w:r>
+            <w:r>
+              <w:rPr>
+                <w:rFonts w:ascii="Times New Roman" w:hAnsi="Times New Roman" w:eastAsia="Times New Roman" w:cs="Times New Roman"/>
+                <w:sz w:val="20"/>
+              </w:rPr>
+              <w:t vyd:_id="vyd:momoyjgox356x5" xml:space="preserve">  </w:t>
+            </w:r>
+            <w:r>
+              <w:rPr>
+                <w:rFonts w:ascii="Times New Roman" w:hAnsi="Times New Roman" w:eastAsia="Times New Roman" w:cs="Times New Roman"/>
+                <w:sz w:val="20"/>
+              </w:rPr>
+              <w:t vyd:_id="vyd:momoyjgnrsoofm">деятельностью</w:t>
+            </w:r>
+          </w:p>
+          <w:p vyd:_id="vyd:momoylaxicndbo">
+            <w:pPr>
+              <w:pStyle w:val="Normal"/>
+              <w:snapToGrid w:val="0"/>
+              <w:spacing w:lineRule="auto" w:line="240" w:before="0" w:after="0"/>
+              <w:rPr>
+                <w:rFonts w:ascii="Times New Roman" w:hAnsi="Times New Roman" w:eastAsia="Times New Roman" w:cs="Times New Roman"/>
+                <w:sz w:val="20"/>
+              </w:rPr>
+            </w:pPr>
+            <w:r>
+              <w:rPr>
+                <w:rFonts w:ascii="Times New Roman" w:hAnsi="Times New Roman" w:eastAsia="Times New Roman" w:cs="Times New Roman"/>
+                <w:sz w:val="20"/>
+              </w:rPr>
+              <w:t vyd:_id="vyd:momoyucsazpctn">Понимание различия между разными</w:t>
+            </w:r>
+            <w:r>
+              <w:rPr>
+                <w:rFonts w:ascii="Times New Roman" w:hAnsi="Times New Roman" w:eastAsia="Times New Roman" w:cs="Times New Roman"/>
+                <w:sz w:val="20"/>
+              </w:rPr>
+              <w:t vyd:_id="vyd:momoyucskc1pwa" xml:space="preserve">  </w:t>
+            </w:r>
+            <w:r>
+              <w:rPr>
+                <w:rFonts w:ascii="Times New Roman" w:hAnsi="Times New Roman" w:eastAsia="Times New Roman" w:cs="Times New Roman"/>
+                <w:sz w:val="20"/>
+              </w:rPr>
+              <w:t vyd:_id="vyd:momoyucrbyi917">типами проектов</w:t>
+            </w:r>
           </w:p>
         </w:tc>
         <w:tc vyd:_id="vyd:0000000000023x">
@@ -4258,14 +4356,20 @@
           <w:p vyd:_id="vyd:0000000000023g">
             <w:pPr>
               <w:pStyle w:val="Normal"/>
-              <w:snapToGrid w:val="0"/>
-              <w:spacing w:lineRule="auto" w:line="240" w:before="0" w:after="0"/>
-              <w:rPr>
-                <w:rFonts w:ascii="Times New Roman" w:hAnsi="Times New Roman" w:cs="Times New Roman"/>
-                <w:sz w:val="24"/>
-                <w:szCs w:val="24"/>
-              </w:rPr>
-            </w:pPr>
+              <w:spacing w:lineRule="auto" w:line="240" w:before="0" w:after="0"/>
+              <w:rPr>
+                <w:rFonts w:ascii="Times New Roman" w:hAnsi="Times New Roman" w:cs="Times New Roman"/>
+                <w:sz w:val="24"/>
+                <w:szCs w:val="24"/>
+              </w:rPr>
+            </w:pPr>
+            <w:r>
+              <w:rPr>
+                <w:rFonts w:ascii="Times New Roman" w:hAnsi="Times New Roman" w:eastAsia="Times New Roman" w:cs="Times New Roman"/>
+                <w:sz w:val="18"/>
+              </w:rPr>
+              <w:t vyd:_id="vyd:momozx90oxfea8">MAX</w:t>
+            </w:r>
           </w:p>
         </w:tc>
         <w:tc vyd:_id="vyd:0000000000023d">
@@ -7908,6 +8012,13 @@
                 <w:szCs w:val="24"/>
               </w:rPr>
             </w:pPr>
+            <w:r>
+              <w:rPr>
+                <w:rFonts w:ascii="Times New Roman" w:hAnsi="Times New Roman" w:cs="Times New Roman"/>
+                <w:sz w:val="24"/>
+              </w:rPr>
+              <w:t vyd:_id="vyd:momp2d3igxbylr">Монотонность функции. Точки экстремума</w:t>
+            </w:r>
           </w:p>
         </w:tc>
         <w:tc vyd:_id="vyd:000000000001u5">
@@ -8125,14 +8236,20 @@
           <w:p vyd:_id="vyd:000000000001to">
             <w:pPr>
               <w:pStyle w:val="Normal"/>
-              <w:snapToGrid w:val="0"/>
-              <w:spacing w:lineRule="auto" w:line="240" w:before="0" w:after="0"/>
-              <w:rPr>
-                <w:rFonts w:ascii="Times New Roman" w:hAnsi="Times New Roman" w:cs="Times New Roman"/>
-                <w:sz w:val="24"/>
-                <w:szCs w:val="24"/>
-              </w:rPr>
-            </w:pPr>
+              <w:spacing w:lineRule="auto" w:line="240" w:before="0" w:after="0"/>
+              <w:rPr>
+                <w:rFonts w:ascii="Times New Roman" w:hAnsi="Times New Roman" w:cs="Times New Roman"/>
+                <w:sz w:val="24"/>
+                <w:szCs w:val="24"/>
+              </w:rPr>
+            </w:pPr>
+            <w:r>
+              <w:rPr>
+                <w:rFonts w:ascii="Times New Roman" w:hAnsi="Times New Roman" w:cs="Times New Roman"/>
+                <w:sz w:val="24"/>
+              </w:rPr>
+              <w:t vyd:_id="vyd:momp2kou65gjto">мах</w:t>
+            </w:r>
           </w:p>
         </w:tc>
         <w:tc vyd:_id="vyd:000000000001tl">
@@ -8364,6 +8481,13 @@
                 <w:szCs w:val="24"/>
               </w:rPr>
             </w:pPr>
+            <w:r>
+              <w:rPr>
+                <w:rFonts w:ascii="Times New Roman" w:hAnsi="Times New Roman" w:cs="Times New Roman"/>
+                <w:sz w:val="24"/>
+              </w:rPr>
+              <w:t vyd:_id="vyd:momp2tm7xjv8gi">Решение задач по теме</w:t>
+            </w:r>
           </w:p>
         </w:tc>
         <w:tc vyd:_id="vyd:000000000001t1">
@@ -8735,7 +8859,7 @@
       </w:tr>
       <w:tr vyd:_id="vyd:000000000001ri">
         <w:trPr>
-          <w:trHeight w:val="23" w:hRule="atLeast"/>
+          <w:trHeight w:val="873.289" w:hRule="atLeast"/>
         </w:trPr>
         <w:tc vyd:_id="vyd:000000000001s1">
           <w:tcPr>
@@ -8860,6 +8984,13 @@
                 <w:szCs w:val="24"/>
               </w:rPr>
             </w:pPr>
+            <w:r>
+              <w:rPr>
+                <w:rFonts w:ascii="Times New Roman" w:hAnsi="Times New Roman" w:cs="Times New Roman"/>
+                <w:sz w:val="24"/>
+              </w:rPr>
+              <w:t vyd:_id="vyd:momp2fmrdbgl87">Монотонность функции. Точки экстремума</w:t>
+            </w:r>
           </w:p>
         </w:tc>
         <w:tc vyd:_id="vyd:000000000001rq">
@@ -9085,14 +9216,20 @@
           <w:p vyd:_id="vyd:000000000001r8">
             <w:pPr>
               <w:pStyle w:val="Normal"/>
-              <w:snapToGrid w:val="0"/>
-              <w:spacing w:lineRule="auto" w:line="240" w:before="0" w:after="0"/>
-              <w:rPr>
-                <w:rFonts w:ascii="Times New Roman" w:hAnsi="Times New Roman" w:cs="Times New Roman"/>
-                <w:sz w:val="24"/>
-                <w:szCs w:val="24"/>
-              </w:rPr>
-            </w:pPr>
+              <w:spacing w:lineRule="auto" w:line="240" w:before="0" w:after="0"/>
+              <w:rPr>
+                <w:rFonts w:ascii="Times New Roman" w:hAnsi="Times New Roman" w:cs="Times New Roman"/>
+                <w:sz w:val="24"/>
+                <w:szCs w:val="24"/>
+              </w:rPr>
+            </w:pPr>
+            <w:r>
+              <w:rPr>
+                <w:rFonts w:ascii="Times New Roman" w:hAnsi="Times New Roman" w:cs="Times New Roman"/>
+                <w:sz w:val="24"/>
+              </w:rPr>
+              <w:t vyd:_id="vyd:momp2o0qnoatrf">мах</w:t>
+            </w:r>
           </w:p>
         </w:tc>
         <w:tc vyd:_id="vyd:000000000001r5">
@@ -9318,6 +9455,23 @@
           <w:p vyd:_id="vyd:000000000001qn">
             <w:pPr>
               <w:pStyle w:val="Normal"/>
+              <w:spacing w:lineRule="auto" w:line="240" w:before="0" w:after="0"/>
+              <w:rPr>
+                <w:rFonts w:ascii="Times New Roman" w:hAnsi="Times New Roman" w:cs="Times New Roman"/>
+                <w:sz w:val="24"/>
+              </w:rPr>
+            </w:pPr>
+            <w:r>
+              <w:rPr>
+                <w:rFonts w:ascii="Times New Roman" w:hAnsi="Times New Roman" w:cs="Times New Roman"/>
+                <w:sz w:val="24"/>
+              </w:rPr>
+              <w:t vyd:_id="vyd:momp30k7nm651u">Решение задач по теме</w:t>
+            </w:r>
+          </w:p>
+          <w:p vyd:_id="vyd:momp30k6atqx20">
+            <w:pPr>
+              <w:pStyle w:val="Normal"/>
               <w:snapToGrid w:val="0"/>
               <w:spacing w:lineRule="auto" w:line="240" w:before="0" w:after="0"/>
               <w:rPr>
@@ -12053,6 +12207,14 @@
                 <w:szCs w:val="24"/>
               </w:rPr>
             </w:pPr>
+            <w:r>
+              <w:rPr>
+                <w:rFonts w:ascii="Times New Roman" w:hAnsi="Times New Roman" w:cs="Times New Roman"/>
+                <w:sz w:val="24"/>
+                <w:color w:val="000000"/>
+              </w:rPr>
+              <w:t vyd:_id="vyd:momp44ab3fcouj">Понятие непрерывности функции. Метод интервалов</w:t>
+            </w:r>
           </w:p>
         </w:tc>
         <w:tc vyd:_id="vyd:000000000001k5">
@@ -12260,7 +12422,6 @@
           <w:p vyd:_id="vyd:000000000001jo">
             <w:pPr>
               <w:pStyle w:val="Normal"/>
-              <w:snapToGrid w:val="0"/>
               <w:spacing w:lineRule="auto" w:line="240" w:before="0" w:after="0"/>
               <w:rPr>
                 <w:rFonts w:ascii="Times New Roman" w:hAnsi="Times New Roman" w:cs="Times New Roman"/>
@@ -12269,6 +12430,13 @@
                 <w:szCs w:val="24"/>
               </w:rPr>
             </w:pPr>
+            <w:r>
+              <w:rPr>
+                <w:rFonts w:ascii="Times New Roman" w:hAnsi="Times New Roman" w:cs="Times New Roman"/>
+                <w:sz w:val="24"/>
+              </w:rPr>
+              <w:t vyd:_id="vyd:momp4cjqi8txhh">Мах</w:t>
+            </w:r>
           </w:p>
         </w:tc>
         <w:tc vyd:_id="vyd:000000000001jl">
@@ -12484,6 +12652,14 @@
                 <w:szCs w:val="24"/>
               </w:rPr>
             </w:pPr>
+            <w:r>
+              <w:rPr>
+                <w:rFonts w:ascii="Times New Roman" w:hAnsi="Times New Roman" w:cs="Times New Roman"/>
+                <w:sz w:val="24"/>
+                <w:color w:val="000000"/>
+              </w:rPr>
+              <w:t vyd:_id="vyd:momp4sc2ljppbv">Решение задач методом интервалов</w:t>
+            </w:r>
           </w:p>
         </w:tc>
         <w:tc vyd:_id="vyd:000000000001j1">
@@ -12938,6 +13114,14 @@
                 <w:szCs w:val="24"/>
               </w:rPr>
             </w:pPr>
+            <w:r>
+              <w:rPr>
+                <w:rFonts w:ascii="Times New Roman" w:hAnsi="Times New Roman" w:cs="Times New Roman"/>
+                <w:sz w:val="24"/>
+                <w:color w:val="000000"/>
+              </w:rPr>
+              <w:t vyd:_id="vyd:momp4771edra79">Понятие непрерывности функции. Метод интервалов</w:t>
+            </w:r>
           </w:p>
         </w:tc>
         <w:tc vyd:_id="vyd:000000000001hv">
@@ -13160,7 +13344,6 @@
           <w:p vyd:_id="vyd:000000000001he">
             <w:pPr>
               <w:pStyle w:val="Normal"/>
-              <w:snapToGrid w:val="0"/>
               <w:spacing w:lineRule="auto" w:line="240" w:before="0" w:after="0"/>
               <w:rPr>
                 <w:rFonts w:ascii="Times New Roman" w:hAnsi="Times New Roman" w:cs="Times New Roman"/>
@@ -13169,6 +13352,13 @@
                 <w:szCs w:val="24"/>
               </w:rPr>
             </w:pPr>
+            <w:r>
+              <w:rPr>
+                <w:rFonts w:ascii="Times New Roman" w:hAnsi="Times New Roman" w:cs="Times New Roman"/>
+                <w:sz w:val="24"/>
+              </w:rPr>
+              <w:t vyd:_id="vyd:momp4ffnbledsa">Мах</w:t>
+            </w:r>
           </w:p>
         </w:tc>
         <w:tc vyd:_id="vyd:000000000001hb">
@@ -13399,6 +13589,14 @@
                 <w:szCs w:val="24"/>
               </w:rPr>
             </w:pPr>
+            <w:r>
+              <w:rPr>
+                <w:rFonts w:ascii="Times New Roman" w:hAnsi="Times New Roman" w:cs="Times New Roman"/>
+                <w:sz w:val="24"/>
+                <w:color w:val="000000"/>
+              </w:rPr>
+              <w:t vyd:_id="vyd:momp4tpe2goln6">Решение задач методом интервалов</w:t>
+            </w:r>
           </w:p>
         </w:tc>
         <w:tc vyd:_id="vyd:000000000001gr">

</xml_diff>

<commit_message>
Sync schedule files 2026-05-01 15:58
</commit_message>
<xml_diff>
--- a/schedule/02.05.2026 СУББОТА.docx
+++ b/schedule/02.05.2026 СУББОТА.docx
@@ -1,6 +1,6 @@
 
 <file path=word/document.xml><?xml version="1.0" encoding="utf-8"?>
-<w:document xmlns:mc="http://schemas.openxmlformats.org/markup-compatibility/2006" xmlns:vyd="http://volga.yandex.com/schemas/document/model" xmlns:w="http://schemas.openxmlformats.org/wordprocessingml/2006/main" xmlns:r="http://schemas.openxmlformats.org/officeDocument/2006/relationships" w:conformance="transitional" mc:Ignorable="vyd">
+<w:document xmlns:vyd="http://volga.yandex.com/schemas/document/model" xmlns:w="http://schemas.openxmlformats.org/wordprocessingml/2006/main" xmlns:r="http://schemas.openxmlformats.org/officeDocument/2006/relationships" xmlns:mc="http://schemas.openxmlformats.org/markup-compatibility/2006" w:conformance="transitional" mc:Ignorable="vyd">
   <w:background w:color="FFFFFF"/>
   <w:body vyd:_id="vyd:00000000000001">
     <w:p vyd:_id="vyd:000000000002e5">
@@ -2968,7 +2968,7 @@
       </w:tr>
       <w:tr vyd:_id="vyd:00000000000263">
         <w:trPr>
-          <w:trHeight w:val="23" w:hRule="atLeast"/>
+          <w:trHeight w:val="2362" w:hRule="atLeast"/>
         </w:trPr>
         <w:tc vyd:_id="vyd:0000000000026l">
           <w:tcPr>
@@ -3123,23 +3123,36 @@
         <w:tc vyd:_id="vyd:0000000000026a">
           <w:tcPr>
             <w:tcBorders>
-              <w:top w:val="single" w:color="000000" w:sz="4" w:space="0"/>
-              <w:start w:val="single" w:color="000000" w:sz="4" w:space="0"/>
-              <w:bottom w:val="single" w:color="000000" w:sz="4" w:space="0"/>
-              <w:end w:val="single" w:color="000000" w:sz="4" w:space="0"/>
-            </w:tcBorders>
+              <w:top w:val="single" w:sz="8"/>
+              <w:start w:val="single" w:sz="8"/>
+              <w:bottom w:val="single" w:sz="8"/>
+              <w:end w:val="single" w:sz="8"/>
+            </w:tcBorders>
+            <w:tcMar>
+              <w:top w:w="0" w:type="dxa"/>
+              <w:start w:w="108" w:type="dxa"/>
+              <w:bottom w:w="0" w:type="dxa"/>
+              <w:end w:w="108" w:type="dxa"/>
+            </w:tcMar>
           </w:tcPr>
           <w:p vyd:_id="vyd:0000000000026b">
             <w:pPr>
-              <w:pStyle w:val="Normal"/>
-              <w:snapToGrid w:val="0"/>
-              <w:spacing w:lineRule="auto" w:line="240" w:before="0" w:after="0"/>
-              <w:rPr>
-                <w:rFonts w:ascii="Times New Roman" w:hAnsi="Times New Roman" w:cs="Times New Roman"/>
-                <w:sz w:val="24"/>
-                <w:szCs w:val="24"/>
-              </w:rPr>
-            </w:pPr>
+              <w:spacing w:after="0" w:before="0"/>
+              <w:ind w:start="0" w:end="0"/>
+              <w:rPr>
+                <w:rFonts w:ascii="Times New Roman" w:hAnsi="Times New Roman" w:cs="Times New Roman"/>
+                <w:sz w:val="24"/>
+                <w:szCs w:val="24"/>
+              </w:rPr>
+            </w:pPr>
+            <w:r>
+              <w:rPr>
+                <w:rFonts w:ascii="Times New Roman" w:hAnsi="Times New Roman" w:eastAsia="Times New Roman" w:cs="Times New Roman"/>
+                <w:sz w:val="24"/>
+                <w:i w:val="1"/>
+              </w:rPr>
+              <w:t vyd:_id="vyd:mon28higx3l71c">Реализация основных этапов процесса анализа данных на примере набора данных из профессиональной сферы</w:t>
+            </w:r>
           </w:p>
         </w:tc>
         <w:tc vyd:_id="vyd:00000000000268">
@@ -3382,15 +3395,20 @@
           </w:tcPr>
           <w:p vyd:_id="vyd:0000000000025r">
             <w:pPr>
-              <w:pStyle w:val="Normal"/>
-              <w:snapToGrid w:val="0"/>
-              <w:spacing w:lineRule="auto" w:line="240" w:before="0" w:after="0"/>
-              <w:rPr>
-                <w:rFonts w:ascii="Times New Roman" w:hAnsi="Times New Roman" w:cs="Times New Roman"/>
-                <w:sz w:val="24"/>
-                <w:szCs w:val="24"/>
-              </w:rPr>
-            </w:pPr>
+              <w:spacing w:lineRule="auto" w:line="276" w:before="0" w:after="0"/>
+              <w:rPr>
+                <w:rFonts w:ascii="Times New Roman" w:hAnsi="Times New Roman" w:cs="Times New Roman"/>
+                <w:sz w:val="24"/>
+                <w:szCs w:val="24"/>
+              </w:rPr>
+            </w:pPr>
+            <w:r>
+              <w:rPr>
+                <w:rFonts w:ascii="Arial" w:hAnsi="Arial" w:eastAsia="Times New Roman" w:cs="Times New Roman"/>
+                <w:sz w:val="22"/>
+              </w:rPr>
+              <w:t vyd:_id="vyd:mon294vqnc2a2w">MAX</w:t>
+            </w:r>
           </w:p>
         </w:tc>
         <w:tc vyd:_id="vyd:0000000000025o">
@@ -3616,6 +3634,13 @@
                 <w:szCs w:val="24"/>
               </w:rPr>
             </w:pPr>
+            <w:r>
+              <w:rPr>
+                <w:rFonts w:ascii="Times New Roman" w:hAnsi="Times New Roman" w:cs="Times New Roman"/>
+                <w:sz w:val="24"/>
+              </w:rPr>
+              <w:t vyd:_id="vyd:mon2ae0t33blni">Практическая работа</w:t>
+            </w:r>
           </w:p>
         </w:tc>
         <w:tc vyd:_id="vyd:00000000000254">
@@ -3990,7 +4015,7 @@
       </w:tr>
       <w:tr vyd:_id="vyd:0000000000023m">
         <w:trPr>
-          <w:trHeight w:val="1848.226" w:hRule="atLeast"/>
+          <w:trHeight w:val="2553.384" w:hRule="atLeast"/>
         </w:trPr>
         <w:tc vyd:_id="vyd:00000000000244">
           <w:tcPr>
@@ -4187,17 +4212,22 @@
         <w:tc vyd:_id="vyd:0000000000023t">
           <w:tcPr>
             <w:tcBorders>
-              <w:top w:val="single" w:color="000000" w:sz="4" w:space="0"/>
-              <w:start w:val="single" w:color="000000" w:sz="4" w:space="0"/>
-              <w:bottom w:val="single" w:color="000000" w:sz="4" w:space="0"/>
-              <w:end w:val="single" w:color="000000" w:sz="4" w:space="0"/>
-            </w:tcBorders>
+              <w:top w:val="single" w:sz="8"/>
+              <w:start w:val="single" w:sz="8"/>
+              <w:bottom w:val="single" w:sz="8"/>
+              <w:end w:val="single" w:sz="8"/>
+            </w:tcBorders>
+            <w:tcMar>
+              <w:top w:w="0" w:type="dxa"/>
+              <w:start w:w="108" w:type="dxa"/>
+              <w:bottom w:w="0" w:type="dxa"/>
+              <w:end w:w="108" w:type="dxa"/>
+            </w:tcMar>
           </w:tcPr>
           <w:p vyd:_id="vyd:0000000000023u">
             <w:pPr>
-              <w:pStyle w:val="Normal"/>
-              <w:snapToGrid w:val="0"/>
-              <w:spacing w:lineRule="auto" w:line="240" w:before="0" w:after="0"/>
+              <w:spacing w:after="0" w:before="0"/>
+              <w:ind w:start="0" w:end="0"/>
               <w:rPr>
                 <w:rFonts w:ascii="Times New Roman" w:hAnsi="Times New Roman" w:cs="Times New Roman"/>
                 <w:sz w:val="24"/>
@@ -4205,6 +4235,14 @@
                 <w:szCs w:val="24"/>
               </w:rPr>
             </w:pPr>
+            <w:r>
+              <w:rPr>
+                <w:rFonts w:ascii="Times New Roman" w:hAnsi="Times New Roman" w:eastAsia="Times New Roman" w:cs="Times New Roman"/>
+                <w:sz w:val="24"/>
+                <w:i w:val="1"/>
+              </w:rPr>
+              <w:t vyd:_id="vyd:mon28lt3vptfo7">Реализация основных этапов процесса анализа данных на примере набора данных из профессиональной сферы</w:t>
+            </w:r>
           </w:p>
         </w:tc>
         <w:tc vyd:_id="vyd:0000000000023r">
@@ -4447,9 +4485,7 @@
           </w:tcPr>
           <w:p vyd:_id="vyd:0000000000023a">
             <w:pPr>
-              <w:pStyle w:val="Normal"/>
-              <w:snapToGrid w:val="0"/>
-              <w:spacing w:lineRule="auto" w:line="240" w:before="0" w:after="0"/>
+              <w:spacing w:lineRule="auto" w:line="276" w:before="0" w:after="0"/>
               <w:rPr>
                 <w:rFonts w:ascii="Times New Roman" w:hAnsi="Times New Roman" w:cs="Times New Roman"/>
                 <w:sz w:val="24"/>
@@ -4457,6 +4493,13 @@
                 <w:szCs w:val="24"/>
               </w:rPr>
             </w:pPr>
+            <w:r>
+              <w:rPr>
+                <w:rFonts w:ascii="Arial" w:hAnsi="Arial" w:eastAsia="Times New Roman" w:cs="Times New Roman"/>
+                <w:sz w:val="22"/>
+              </w:rPr>
+              <w:t vyd:_id="vyd:mon29ai5nna5wj">MAX</w:t>
+            </w:r>
           </w:p>
         </w:tc>
         <w:tc vyd:_id="vyd:00000000000237">
@@ -4708,10 +4751,18 @@
               <w:rPr>
                 <w:rFonts w:ascii="Times New Roman" w:hAnsi="Times New Roman" w:cs="Times New Roman"/>
                 <w:sz w:val="24"/>
-                <w:color w:val="FF0000"/>
-                <w:szCs w:val="24"/>
-              </w:rPr>
-            </w:pPr>
+                <w:color w:val="000000"/>
+                <w:szCs w:val="24"/>
+              </w:rPr>
+            </w:pPr>
+            <w:r>
+              <w:rPr>
+                <w:rFonts w:ascii="Times New Roman" w:hAnsi="Times New Roman" w:cs="Times New Roman"/>
+                <w:sz w:val="24"/>
+                <w:color w:val="000000"/>
+              </w:rPr>
+              <w:t vyd:_id="vyd:mon2aslizn404k">Практическая работа</w:t>
+            </w:r>
           </w:p>
         </w:tc>
         <w:tc vyd:_id="vyd:0000000000022m">
@@ -4789,7 +4840,7 @@
       </w:tr>
       <w:tr vyd:_id="vyd:0000000000021t">
         <w:trPr>
-          <w:trHeight w:val="23" w:hRule="atLeast"/>
+          <w:trHeight w:val="900.071" w:hRule="atLeast"/>
         </w:trPr>
         <w:tc vyd:_id="vyd:0000000000022e">
           <w:tcPr>
@@ -8092,6 +8143,14 @@
                 <w:szCs w:val="24"/>
               </w:rPr>
             </w:pPr>
+            <w:r>
+              <w:rPr>
+                <w:rFonts w:ascii="Times New Roman" w:hAnsi="Times New Roman" w:eastAsia="Times New Roman" w:cs="Times New Roman"/>
+                <w:sz w:val="24"/>
+                <w:i w:val="1"/>
+              </w:rPr>
+              <w:t vyd:_id="vyd:mon2t6ht5m72yh">Создание 3 D моделей с элементами закругления (скругления) и фасками</w:t>
+            </w:r>
           </w:p>
         </w:tc>
         <w:tc vyd:_id="vyd:000000000001tz">
@@ -8119,7 +8178,7 @@
       </w:tr>
       <w:tr vyd:_id="vyd:000000000001te">
         <w:trPr>
-          <w:trHeight w:val="280" w:hRule="atLeast"/>
+          <w:trHeight w:val="235.241" w:hRule="atLeast"/>
         </w:trPr>
         <w:tc vyd:_id="vyd:000000000001tw">
           <w:tcPr>
@@ -8323,6 +8382,13 @@
                 <w:szCs w:val="24"/>
               </w:rPr>
             </w:pPr>
+            <w:r>
+              <w:rPr>
+                <w:rFonts w:ascii="Times New Roman" w:hAnsi="Times New Roman" w:cs="Times New Roman"/>
+                <w:sz w:val="24"/>
+              </w:rPr>
+              <w:t vyd:_id="vyd:mon2t5ye5ph2yl">мах</w:t>
+            </w:r>
           </w:p>
         </w:tc>
         <w:tc vyd:_id="vyd:000000000001tf">
@@ -8560,6 +8626,14 @@
                 <w:szCs w:val="24"/>
               </w:rPr>
             </w:pPr>
+            <w:r>
+              <w:rPr>
+                <w:rFonts w:ascii="Times New Roman" w:hAnsi="Times New Roman" w:cs="Times New Roman"/>
+                <w:sz w:val="24"/>
+                <w:color w:val="000000"/>
+              </w:rPr>
+              <w:t vyd:_id="vyd:mon2t7vuf7u803">Практическая работа</w:t>
+            </w:r>
           </w:p>
         </w:tc>
         <w:tc vyd:_id="vyd:000000000001sv">
@@ -9066,11 +9140,11 @@
             </w:pPr>
             <w:r>
               <w:rPr>
-                <w:rFonts w:ascii="Times New Roman" w:hAnsi="Times New Roman" w:cs="Times New Roman"/>
-                <w:sz w:val="24"/>
-                <w:szCs w:val="24"/>
-              </w:rPr>
-              <w:t vyd:_id="vyd:000000000001rn">Тригонометрические уравнения</w:t>
+                <w:rFonts w:ascii="Times New Roman" w:hAnsi="Times New Roman" w:eastAsia="Times New Roman" w:cs="Times New Roman"/>
+                <w:sz w:val="24"/>
+                <w:i w:val="1"/>
+              </w:rPr>
+              <w:t vyd:_id="vyd:mon2t6tu8s9g7f">Создание 3 D моделей с элементами закругления (скругления) и фасками</w:t>
             </w:r>
           </w:p>
         </w:tc>
@@ -9307,9 +9381,8 @@
               <w:rPr>
                 <w:rFonts w:ascii="Times New Roman" w:hAnsi="Times New Roman" w:cs="Times New Roman"/>
                 <w:sz w:val="24"/>
-                <w:szCs w:val="24"/>
-              </w:rPr>
-              <w:t vyd:_id="vyd:000000000001r2">макс</w:t>
+              </w:rPr>
+              <w:t vyd:_id="vyd:mon2t4xe9agtx6">мах</w:t>
             </w:r>
           </w:p>
         </w:tc>
@@ -9552,9 +9625,9 @@
               <w:rPr>
                 <w:rFonts w:ascii="Times New Roman" w:hAnsi="Times New Roman" w:cs="Times New Roman"/>
                 <w:sz w:val="24"/>
-                <w:szCs w:val="24"/>
-              </w:rPr>
-              <w:t vyd:_id="vyd:000000000001qh">СДО onlinetestpad</w:t>
+                <w:color w:val="000000"/>
+              </w:rPr>
+              <w:t vyd:_id="vyd:mon2t8ei84vvk8">Практическая работа</w:t>
             </w:r>
           </w:p>
         </w:tc>
@@ -11125,6 +11198,23 @@
           <w:p vyd:_id="vyd:000000000001me">
             <w:pPr>
               <w:pStyle w:val="Normal"/>
+              <w:spacing w:lineRule="auto" w:line="240" w:before="0" w:after="0"/>
+              <w:rPr>
+                <w:rFonts w:ascii="Times New Roman" w:hAnsi="Times New Roman" w:cs="Times New Roman"/>
+                <w:sz w:val="24"/>
+              </w:rPr>
+            </w:pPr>
+            <w:r>
+              <w:rPr>
+                <w:rFonts w:ascii="Times New Roman" w:hAnsi="Times New Roman" w:cs="Times New Roman"/>
+                <w:sz w:val="24"/>
+              </w:rPr>
+              <w:t vyd:_id="vyd:mon2c2wy0i1if1">Тригонометрические уравнения</w:t>
+            </w:r>
+          </w:p>
+          <w:p vyd:_id="vyd:mon2c2wukd24tr">
+            <w:pPr>
+              <w:pStyle w:val="Normal"/>
               <w:snapToGrid w:val="0"/>
               <w:spacing w:lineRule="auto" w:line="240" w:before="0" w:after="0"/>
               <w:rPr>
@@ -11362,14 +11452,20 @@
           <w:p vyd:_id="vyd:000000000001lu">
             <w:pPr>
               <w:pStyle w:val="Normal"/>
-              <w:snapToGrid w:val="0"/>
-              <w:spacing w:lineRule="auto" w:line="240" w:before="0" w:after="0"/>
-              <w:rPr>
-                <w:rFonts w:ascii="Times New Roman" w:hAnsi="Times New Roman" w:cs="Times New Roman"/>
-                <w:sz w:val="24"/>
-                <w:szCs w:val="24"/>
-              </w:rPr>
-            </w:pPr>
+              <w:spacing w:lineRule="auto" w:line="240" w:before="0" w:after="0"/>
+              <w:rPr>
+                <w:rFonts w:ascii="Times New Roman" w:hAnsi="Times New Roman" w:cs="Times New Roman"/>
+                <w:sz w:val="24"/>
+                <w:szCs w:val="24"/>
+              </w:rPr>
+            </w:pPr>
+            <w:r>
+              <w:rPr>
+                <w:rFonts w:ascii="Times New Roman" w:hAnsi="Times New Roman" w:cs="Times New Roman"/>
+                <w:sz w:val="24"/>
+              </w:rPr>
+              <w:t vyd:_id="vyd:mon2cf9xw0urca">макс</w:t>
+            </w:r>
           </w:p>
         </w:tc>
         <w:tc vyd:_id="vyd:000000000001lr">
@@ -11596,6 +11692,20 @@
             </w:tcBorders>
           </w:tcPr>
           <w:p vyd:_id="vyd:000000000001la">
+            <w:pPr>
+              <w:pStyle w:val="Normal"/>
+              <w:spacing w:lineRule="auto" w:line="240" w:before="0" w:after="0"/>
+              <w:rPr/>
+            </w:pPr>
+            <w:r>
+              <w:rPr>
+                <w:rFonts w:ascii="Times New Roman" w:hAnsi="Times New Roman" w:cs="Times New Roman"/>
+                <w:sz w:val="24"/>
+              </w:rPr>
+              <w:t vyd:_id="vyd:mon2cqln61k7aj">СДО onlinetestpad</w:t>
+            </w:r>
+          </w:p>
+          <w:p vyd:_id="vyd:mon2cqlkcco7jo">
             <w:pPr>
               <w:pStyle w:val="Normal"/>
               <w:snapToGrid w:val="0"/>

</xml_diff>

<commit_message>
Sync schedule files 2026-05-02 05:37
</commit_message>
<xml_diff>
--- a/schedule/02.05.2026 СУББОТА.docx
+++ b/schedule/02.05.2026 СУББОТА.docx
@@ -1,6 +1,6 @@
 
 <file path=word/document.xml><?xml version="1.0" encoding="utf-8"?>
-<w:document xmlns:vyd="http://volga.yandex.com/schemas/document/model" xmlns:w="http://schemas.openxmlformats.org/wordprocessingml/2006/main" xmlns:r="http://schemas.openxmlformats.org/officeDocument/2006/relationships" xmlns:mc="http://schemas.openxmlformats.org/markup-compatibility/2006" w:conformance="transitional" mc:Ignorable="vyd">
+<w:document xmlns:r="http://schemas.openxmlformats.org/officeDocument/2006/relationships" xmlns:mc="http://schemas.openxmlformats.org/markup-compatibility/2006" xmlns:vyd="http://volga.yandex.com/schemas/document/model" xmlns:w="http://schemas.openxmlformats.org/wordprocessingml/2006/main" w:conformance="transitional" mc:Ignorable="vyd">
   <w:background w:color="FFFFFF"/>
   <w:body vyd:_id="vyd:00000000000001">
     <w:p vyd:_id="vyd:000000000002e5">
@@ -7090,8 +7090,8 @@
         <w:gridCol w:w="1984"/>
         <w:gridCol w:w="1984"/>
         <w:gridCol w:w="1955.5"/>
-        <w:gridCol w:w="2012.5"/>
-        <w:gridCol w:w="1984"/>
+        <w:gridCol w:w="2070"/>
+        <w:gridCol w:w="1926.5"/>
         <w:gridCol w:w="1984"/>
         <w:gridCol w:w="1984"/>
       </w:tblGrid>
@@ -10057,7 +10057,7 @@
                 <w:rFonts w:ascii="Times New Roman" w:hAnsi="Times New Roman" w:cs="Times New Roman"/>
                 <w:sz w:val="24"/>
               </w:rPr>
-              <w:t vyd:_id="vyd:molbkjzy01afdj">В. В.  Мяковский.  Лирка.</w:t>
+              <w:t vyd:_id="vyd:molbkjzy01afdj">В. В.  Мяковский.  Лирика.</w:t>
             </w:r>
           </w:p>
         </w:tc>
@@ -10157,10 +10157,16 @@
               <w:spacing w:lineRule="auto" w:line="240" w:before="0" w:after="0"/>
               <w:rPr>
                 <w:rFonts w:ascii="Times New Roman" w:hAnsi="Times New Roman" w:cs="Times New Roman"/>
-                <w:sz w:val="24"/>
-                <w:szCs w:val="24"/>
-              </w:rPr>
-            </w:pPr>
+                <w:sz w:val="28"/>
+                <w:szCs w:val="24"/>
+              </w:rPr>
+            </w:pPr>
+            <w:r>
+              <w:rPr>
+                <w:sz w:val="22"/>
+              </w:rPr>
+              <w:t vyd:_id="vyd:monvl140b8nnu9">Пружинный маятник. Математический маятник. Уравнение гармонических колебаний.</w:t>
+            </w:r>
           </w:p>
         </w:tc>
         <w:tc vyd:_id="vyd:000000000001ox">
@@ -10401,6 +10407,13 @@
                 <w:szCs w:val="24"/>
               </w:rPr>
             </w:pPr>
+            <w:r>
+              <w:rPr>
+                <w:rFonts w:ascii="Times New Roman" w:hAnsi="Times New Roman" w:cs="Times New Roman"/>
+                <w:sz w:val="24"/>
+              </w:rPr>
+              <w:t vyd:_id="vyd:monvo4f80wkb9d">макс</w:t>
+            </w:r>
           </w:p>
         </w:tc>
         <w:tc vyd:_id="vyd:000000000001oc">
@@ -10643,6 +10656,9 @@
                 <w:szCs w:val="24"/>
               </w:rPr>
             </w:pPr>
+            <w:r>
+              <w:t vyd:_id="vyd:monvmt6avto4t2">Учебник В.Ф.Дмитриева, конспект по теме</w:t>
+            </w:r>
           </w:p>
         </w:tc>
         <w:tc vyd:_id="vyd:000000000001nr">
@@ -10921,14 +10937,14 @@
               <w:spacing w:lineRule="auto" w:line="240" w:before="0" w:after="0"/>
               <w:rPr>
                 <w:rFonts w:ascii="Times New Roman" w:hAnsi="Times New Roman" w:cs="Times New Roman"/>
-                <w:sz w:val="24"/>
-                <w:szCs w:val="24"/>
-              </w:rPr>
-            </w:pPr>
-            <w:r>
-              <w:rPr>
-                <w:rFonts w:ascii="Times New Roman" w:hAnsi="Times New Roman" w:cs="Times New Roman"/>
-                <w:sz w:val="24"/>
+                <w:sz w:val="22"/>
+                <w:szCs w:val="24"/>
+              </w:rPr>
+            </w:pPr>
+            <w:r>
+              <w:rPr>
+                <w:rFonts w:ascii="Times New Roman" w:hAnsi="Times New Roman" w:cs="Times New Roman"/>
+                <w:sz w:val="22"/>
                 <w:szCs w:val="24"/>
               </w:rPr>
               <w:t vyd:_id="vyd:000000000001n3">Физика Андреева В.П.к.23(1)</w:t>
@@ -11106,7 +11122,7 @@
                 <w:rFonts w:ascii="Times New Roman" w:hAnsi="Times New Roman" w:cs="Times New Roman"/>
                 <w:sz w:val="24"/>
               </w:rPr>
-              <w:t vyd:_id="vyd:molbks54y6u7gk">В. В.  Мяковский.  Лирка.</w:t>
+              <w:t vyd:_id="vyd:molbks54y6u7gk">В. В.  Мяковский.  Лирика.</w:t>
             </w:r>
           </w:p>
         </w:tc>
@@ -11180,10 +11196,24 @@
               <w:spacing w:lineRule="auto" w:line="240" w:before="0" w:after="0"/>
               <w:rPr>
                 <w:rFonts w:ascii="Times New Roman" w:hAnsi="Times New Roman" w:cs="Times New Roman"/>
-                <w:sz w:val="24"/>
-                <w:szCs w:val="24"/>
-              </w:rPr>
-            </w:pPr>
+                <w:sz w:val="22"/>
+                <w:szCs w:val="24"/>
+              </w:rPr>
+            </w:pPr>
+            <w:r>
+              <w:rPr>
+                <w:rFonts w:ascii="Times New Roman" w:hAnsi="Times New Roman" w:eastAsia="Times New Roman" w:cs="Times New Roman"/>
+                <w:sz w:val="20"/>
+              </w:rPr>
+              <w:t vyd:_id="vyd:monvft4sciflui">.</w:t>
+            </w:r>
+            <w:r>
+              <w:rPr>
+                <w:rFonts w:ascii="Times New Roman" w:hAnsi="Times New Roman" w:eastAsia="Times New Roman" w:cs="Times New Roman"/>
+                <w:sz w:val="22"/>
+              </w:rPr>
+              <w:t vyd:_id="vyd:monvpmqhn1f44d">Превращение энергии при гармонических колебаниях</w:t>
+            </w:r>
           </w:p>
         </w:tc>
         <w:tc vyd:_id="vyd:000000000001md">
@@ -11438,6 +11468,13 @@
                 <w:szCs w:val="24"/>
               </w:rPr>
             </w:pPr>
+            <w:r>
+              <w:rPr>
+                <w:rFonts w:ascii="Times New Roman" w:hAnsi="Times New Roman" w:cs="Times New Roman"/>
+                <w:sz w:val="24"/>
+              </w:rPr>
+              <w:t vyd:_id="vyd:monvocetfeqpuw">макс</w:t>
+            </w:r>
           </w:p>
         </w:tc>
         <w:tc vyd:_id="vyd:000000000001lt">
@@ -11680,6 +11717,13 @@
                 <w:szCs w:val="24"/>
               </w:rPr>
             </w:pPr>
+            <w:r>
+              <w:rPr>
+                <w:rFonts w:ascii="Calibri" w:hAnsi="Calibri" w:eastAsia="Calibri" w:cs="Calibri"/>
+                <w:sz w:val="22"/>
+              </w:rPr>
+              <w:t vyd:_id="vyd:monvnz4rprt65d">Учебник В.Ф.Дмитриева, конспект по теме</w:t>
+            </w:r>
           </w:p>
         </w:tc>
         <w:tc vyd:_id="vyd:000000000001l9">

</xml_diff>